<commit_message>
Program Master Plan v2: stage hierarchy rule - core speakers on main stage, halls for labs and parallel sessions
</commit_message>
<xml_diff>
--- a/docs/IndabaX_2026_Program_Master_Plan.docx
+++ b/docs/IndabaX_2026_Program_Master_Plan.docx
@@ -82,6 +82,24 @@
                 <w:sz w:val="18"/>
               </w:rPr>
               <w:t>first signed takes the slot; a late marquee acceptance goes to the 16:15 plenary of the same day ("printed program closed" line). No session runs without a named backup by 5 August.</w:t>
+            </w:r>
+          </w:p>
+          <w:p>
+            <w:r>
+              <w:rPr>
+                <w:b/>
+                <w:i w:val="0"/>
+                <w:sz w:val="18"/>
+              </w:rPr>
+              <w:t xml:space="preserve">Stage hierarchy rule: </w:t>
+            </w:r>
+            <w:r>
+              <w:rPr>
+                <w:b w:val="0"/>
+                <w:i w:val="0"/>
+                <w:sz w:val="18"/>
+              </w:rPr>
+              <w:t>the main stage belongs to the people the conference stands on (confirmed core speakers, marquee guests) plus the published Gold/Platinum 30-minute slots. Halls host labs, parallel open sessions and student talks. Workshop talk-parts happen on the main stage; only the hands-on part moves to Hall A.</w:t>
             </w:r>
           </w:p>
         </w:tc>
@@ -479,7 +497,7 @@
                 <w:i w:val="0"/>
                 <w:sz w:val="17"/>
               </w:rPr>
-              <w:t>15:00-15:30</w:t>
+              <w:t>10:20-11:00</w:t>
             </w:r>
           </w:p>
         </w:tc>
@@ -494,7 +512,7 @@
                 <w:i w:val="0"/>
                 <w:sz w:val="17"/>
               </w:rPr>
-              <w:t>Industry talk I (reserved sponsor slot)</w:t>
+              <w:t>Main-stage talk: why models die in production (W2 part 1)</w:t>
             </w:r>
           </w:p>
         </w:tc>
@@ -507,10 +525,10 @@
               <w:rPr>
                 <w:b/>
                 <w:i w:val="0"/>
-                <w:color w:val="B32D2D"/>
+                <w:color w:val="0F6E5E"/>
                 <w:sz w:val="17"/>
               </w:rPr>
-              <w:t>OPEN: Gold/Platinum sponsor</w:t>
+              <w:t>CONFIRMED: Dr. Hazem Ali (Founder and CEO, Skytells; Microsoft AI MVP)</w:t>
             </w:r>
           </w:p>
         </w:tc>
@@ -525,7 +543,7 @@
                 <w:i w:val="0"/>
                 <w:sz w:val="17"/>
               </w:rPr>
-              <w:t>30 minutes. Sponsor presents a real technical case study, not a company ad: a system they built, the failure they fixed, the stack they used. Committee reviews slides beforehand.</w:t>
+              <w:t>40 minutes to the full hall: drift, silent failures, retraining debt, monitoring blind spots, real cases from two decades of enterprise AI. Ends with an open call: whoever wants to build this for real, Hall A at 11:10. The hands-on continues there as W2 part 2.</w:t>
             </w:r>
           </w:p>
         </w:tc>
@@ -543,7 +561,7 @@
                 <w:i w:val="0"/>
                 <w:sz w:val="17"/>
               </w:rPr>
-              <w:t>15:30-16:00</w:t>
+              <w:t>11:00-11:45</w:t>
             </w:r>
           </w:p>
         </w:tc>
@@ -559,7 +577,137 @@
                 <w:i w:val="0"/>
                 <w:sz w:val="17"/>
               </w:rPr>
-              <w:t>Industry talk II (reserved sponsor slot)</w:t>
+              <w:t>Main-stage session: building iSchool from Egypt to MENA scale</w:t>
+            </w:r>
+          </w:p>
+        </w:tc>
+        <w:tc>
+          <w:tcPr>
+            <w:tcW w:type="dxa" w:w="1944"/>
+            <w:shd w:val="clear" w:color="auto" w:fill="EEF4F2"/>
+          </w:tcPr>
+          <w:p>
+            <w:r>
+              <w:rPr>
+                <w:b/>
+                <w:i w:val="0"/>
+                <w:color w:val="B07412"/>
+                <w:sz w:val="17"/>
+              </w:rPr>
+              <w:t>INVITED: Muhammad Gawish (Co-founder and CEO, iSchool)</w:t>
+            </w:r>
+          </w:p>
+        </w:tc>
+        <w:tc>
+          <w:tcPr>
+            <w:tcW w:type="dxa" w:w="5184"/>
+            <w:shd w:val="clear" w:color="auto" w:fill="EEF4F2"/>
+          </w:tcPr>
+          <w:p>
+            <w:r>
+              <w:rPr>
+                <w:b w:val="0"/>
+                <w:i w:val="0"/>
+                <w:sz w:val="17"/>
+              </w:rPr>
+              <w:t>35 minutes plus 10 of questions. The story told operationally: first product, first hires, the economics of education, 131,000 learners, and what he would not do again.</w:t>
+            </w:r>
+          </w:p>
+        </w:tc>
+      </w:tr>
+      <w:tr>
+        <w:tc>
+          <w:tcPr>
+            <w:tcW w:type="dxa" w:w="1080"/>
+          </w:tcPr>
+          <w:p>
+            <w:r>
+              <w:rPr>
+                <w:b/>
+                <w:i w:val="0"/>
+                <w:sz w:val="17"/>
+              </w:rPr>
+              <w:t>11:45-12:25</w:t>
+            </w:r>
+          </w:p>
+        </w:tc>
+        <w:tc>
+          <w:tcPr>
+            <w:tcW w:type="dxa" w:w="2160"/>
+          </w:tcPr>
+          <w:p>
+            <w:r>
+              <w:rPr>
+                <w:b/>
+                <w:i w:val="0"/>
+                <w:sz w:val="17"/>
+              </w:rPr>
+              <w:t>Main-stage talk: vision systems at national scale</w:t>
+            </w:r>
+          </w:p>
+        </w:tc>
+        <w:tc>
+          <w:tcPr>
+            <w:tcW w:type="dxa" w:w="1944"/>
+          </w:tcPr>
+          <w:p>
+            <w:r>
+              <w:rPr>
+                <w:b/>
+                <w:i w:val="0"/>
+                <w:color w:val="B07412"/>
+                <w:sz w:val="17"/>
+              </w:rPr>
+              <w:t>INVITED: Asmaa Ahmed E. Osman (Staff AI Vision Scientist, Fawry; Lecturer, FCAI-CU)</w:t>
+            </w:r>
+          </w:p>
+        </w:tc>
+        <w:tc>
+          <w:tcPr>
+            <w:tcW w:type="dxa" w:w="5184"/>
+          </w:tcPr>
+          <w:p>
+            <w:r>
+              <w:rPr>
+                <w:b w:val="0"/>
+                <w:i w:val="0"/>
+                <w:sz w:val="17"/>
+              </w:rPr>
+              <w:t>Document and identity verification at Egypt's largest fintech: where models fail on real documents, and the bridge from lecture hall to production line.</w:t>
+            </w:r>
+          </w:p>
+        </w:tc>
+      </w:tr>
+      <w:tr>
+        <w:tc>
+          <w:tcPr>
+            <w:tcW w:type="dxa" w:w="1080"/>
+            <w:shd w:val="clear" w:color="auto" w:fill="EEF4F2"/>
+          </w:tcPr>
+          <w:p>
+            <w:r>
+              <w:rPr>
+                <w:b/>
+                <w:i w:val="0"/>
+                <w:sz w:val="17"/>
+              </w:rPr>
+              <w:t>15:00-15:30</w:t>
+            </w:r>
+          </w:p>
+        </w:tc>
+        <w:tc>
+          <w:tcPr>
+            <w:tcW w:type="dxa" w:w="2160"/>
+            <w:shd w:val="clear" w:color="auto" w:fill="EEF4F2"/>
+          </w:tcPr>
+          <w:p>
+            <w:r>
+              <w:rPr>
+                <w:b/>
+                <w:i w:val="0"/>
+                <w:sz w:val="17"/>
+              </w:rPr>
+              <w:t>Industry talk I (reserved sponsor slot)</w:t>
             </w:r>
           </w:p>
         </w:tc>
@@ -592,7 +740,7 @@
                 <w:i w:val="0"/>
                 <w:sz w:val="17"/>
               </w:rPr>
-              <w:t>Same format as Industry talk I.</w:t>
+              <w:t>30 minutes. Sponsor presents a real technical case study, not a company ad: a system they built, the failure they fixed, the stack they used. Committee reviews slides beforehand.</w:t>
             </w:r>
           </w:p>
         </w:tc>
@@ -609,6 +757,70 @@
                 <w:i w:val="0"/>
                 <w:sz w:val="17"/>
               </w:rPr>
+              <w:t>15:30-16:00</w:t>
+            </w:r>
+          </w:p>
+        </w:tc>
+        <w:tc>
+          <w:tcPr>
+            <w:tcW w:type="dxa" w:w="2160"/>
+          </w:tcPr>
+          <w:p>
+            <w:r>
+              <w:rPr>
+                <w:b/>
+                <w:i w:val="0"/>
+                <w:sz w:val="17"/>
+              </w:rPr>
+              <w:t>Industry talk II (reserved sponsor slot)</w:t>
+            </w:r>
+          </w:p>
+        </w:tc>
+        <w:tc>
+          <w:tcPr>
+            <w:tcW w:type="dxa" w:w="1944"/>
+          </w:tcPr>
+          <w:p>
+            <w:r>
+              <w:rPr>
+                <w:b/>
+                <w:i w:val="0"/>
+                <w:color w:val="B32D2D"/>
+                <w:sz w:val="17"/>
+              </w:rPr>
+              <w:t>OPEN: Gold/Platinum sponsor</w:t>
+            </w:r>
+          </w:p>
+        </w:tc>
+        <w:tc>
+          <w:tcPr>
+            <w:tcW w:type="dxa" w:w="5184"/>
+          </w:tcPr>
+          <w:p>
+            <w:r>
+              <w:rPr>
+                <w:b w:val="0"/>
+                <w:i w:val="0"/>
+                <w:sz w:val="17"/>
+              </w:rPr>
+              <w:t>Same format as Industry talk I.</w:t>
+            </w:r>
+          </w:p>
+        </w:tc>
+      </w:tr>
+      <w:tr>
+        <w:tc>
+          <w:tcPr>
+            <w:tcW w:type="dxa" w:w="1080"/>
+            <w:shd w:val="clear" w:color="auto" w:fill="EEF4F2"/>
+          </w:tcPr>
+          <w:p>
+            <w:r>
+              <w:rPr>
+                <w:b/>
+                <w:i w:val="0"/>
+                <w:sz w:val="17"/>
+              </w:rPr>
               <w:t>16:15-17:00</w:t>
             </w:r>
           </w:p>
@@ -616,6 +828,7 @@
         <w:tc>
           <w:tcPr>
             <w:tcW w:type="dxa" w:w="2160"/>
+            <w:shd w:val="clear" w:color="auto" w:fill="EEF4F2"/>
           </w:tcPr>
           <w:p>
             <w:r>
@@ -631,6 +844,7 @@
         <w:tc>
           <w:tcPr>
             <w:tcW w:type="dxa" w:w="1944"/>
+            <w:shd w:val="clear" w:color="auto" w:fill="EEF4F2"/>
           </w:tcPr>
           <w:p>
             <w:r>
@@ -647,6 +861,7 @@
         <w:tc>
           <w:tcPr>
             <w:tcW w:type="dxa" w:w="5184"/>
+            <w:shd w:val="clear" w:color="auto" w:fill="EEF4F2"/>
           </w:tcPr>
           <w:p>
             <w:r>
@@ -664,7 +879,6 @@
         <w:tc>
           <w:tcPr>
             <w:tcW w:type="dxa" w:w="1080"/>
-            <w:shd w:val="clear" w:color="auto" w:fill="EEF4F2"/>
           </w:tcPr>
           <w:p>
             <w:r>
@@ -680,7 +894,6 @@
         <w:tc>
           <w:tcPr>
             <w:tcW w:type="dxa" w:w="2160"/>
-            <w:shd w:val="clear" w:color="auto" w:fill="EEF4F2"/>
           </w:tcPr>
           <w:p>
             <w:r>
@@ -696,7 +909,6 @@
         <w:tc>
           <w:tcPr>
             <w:tcW w:type="dxa" w:w="1944"/>
-            <w:shd w:val="clear" w:color="auto" w:fill="EEF4F2"/>
           </w:tcPr>
           <w:p>
             <w:r>
@@ -713,7 +925,6 @@
         <w:tc>
           <w:tcPr>
             <w:tcW w:type="dxa" w:w="5184"/>
-            <w:shd w:val="clear" w:color="auto" w:fill="EEF4F2"/>
           </w:tcPr>
           <w:p>
             <w:r>
@@ -744,7 +955,7 @@
           <w:color w:val="0F6E5E"/>
           <w:sz w:val="23"/>
         </w:rPr>
-        <w:t>Hall A - Workshops (hands-on room)</w:t>
+        <w:t>Hall A - Workshops (hands-on room). Rule: talk parts happen on the main stage; Hall A is for building only</w:t>
       </w:r>
     </w:p>
     <w:tbl>
@@ -771,7 +982,132 @@
                 <w:color w:val="142A4F"/>
                 <w:sz w:val="20"/>
               </w:rPr>
-              <w:t>W1 (10:20-12:30, two blocks with a 10-min break): Build your first RAG system, in Arabic</w:t>
+              <w:t>W2 part 2 (11:10-12:30): production ML lab, continuation of Dr. Hazem's main-stage talk</w:t>
+            </w:r>
+          </w:p>
+          <w:p>
+            <w:r>
+              <w:rPr>
+                <w:b/>
+                <w:i w:val="0"/>
+                <w:sz w:val="18"/>
+              </w:rPr>
+              <w:t xml:space="preserve">Lead: </w:t>
+            </w:r>
+            <w:r>
+              <w:rPr>
+                <w:b w:val="0"/>
+                <w:i w:val="0"/>
+                <w:sz w:val="18"/>
+              </w:rPr>
+              <w:t>CONFIRMED: Dr. Hazem Ali. The talk (part 1) is on the main stage at 10:20; this is the build.</w:t>
+            </w:r>
+          </w:p>
+          <w:p>
+            <w:r>
+              <w:rPr>
+                <w:b/>
+                <w:i w:val="0"/>
+                <w:sz w:val="18"/>
+              </w:rPr>
+              <w:t xml:space="preserve">Format split: </w:t>
+            </w:r>
+            <w:r>
+              <w:rPr>
+                <w:b w:val="0"/>
+                <w:i w:val="0"/>
+                <w:sz w:val="18"/>
+              </w:rPr>
+              <w:t>80 minutes fully hands-on for the subset that follows him from the plenary.</w:t>
+            </w:r>
+          </w:p>
+          <w:p>
+            <w:r>
+              <w:rPr>
+                <w:b/>
+                <w:i w:val="0"/>
+                <w:sz w:val="18"/>
+              </w:rPr>
+              <w:t xml:space="preserve">Content, in order: </w:t>
+            </w:r>
+            <w:r>
+              <w:rPr>
+                <w:b w:val="0"/>
+                <w:i w:val="0"/>
+                <w:sz w:val="18"/>
+              </w:rPr>
+              <w:t>Take a trained model from a notebook to a served endpoint: package it, containerize it, deploy, then attach basic monitoring and an alert.</w:t>
+            </w:r>
+          </w:p>
+          <w:p>
+            <w:r>
+              <w:rPr>
+                <w:b/>
+                <w:i w:val="0"/>
+                <w:sz w:val="18"/>
+              </w:rPr>
+              <w:t xml:space="preserve">What attendees leave with: </w:t>
+            </w:r>
+            <w:r>
+              <w:rPr>
+                <w:b w:val="0"/>
+                <w:i w:val="0"/>
+                <w:sz w:val="18"/>
+              </w:rPr>
+              <w:t>A model of their own deployed behind an endpoint with a live monitoring dashboard.</w:t>
+            </w:r>
+          </w:p>
+          <w:p>
+            <w:r>
+              <w:rPr>
+                <w:b/>
+                <w:i w:val="0"/>
+                <w:sz w:val="18"/>
+              </w:rPr>
+              <w:t xml:space="preserve">Prerequisites: </w:t>
+            </w:r>
+            <w:r>
+              <w:rPr>
+                <w:b w:val="0"/>
+                <w:i w:val="0"/>
+                <w:sz w:val="18"/>
+              </w:rPr>
+              <w:t>Laptop, basic Python, Docker installed or Colab fallback provided.</w:t>
+            </w:r>
+          </w:p>
+        </w:tc>
+      </w:tr>
+    </w:tbl>
+    <w:p>
+      <w:pPr>
+        <w:spacing w:after="40"/>
+      </w:pPr>
+    </w:p>
+    <w:tbl>
+      <w:tblPr>
+        <w:tblStyle w:val="TableGrid"/>
+        <w:tblW w:type="auto" w:w="0"/>
+        <w:tblLayout w:type="fixed"/>
+        <w:tblLook w:firstColumn="1" w:firstRow="1" w:lastColumn="0" w:lastRow="0" w:noHBand="0" w:noVBand="1" w:val="04A0"/>
+      </w:tblPr>
+      <w:tblGrid>
+        <w:gridCol w:w="10206"/>
+      </w:tblGrid>
+      <w:tr>
+        <w:tc>
+          <w:tcPr>
+            <w:tcW w:type="dxa" w:w="10368"/>
+            <w:shd w:val="clear" w:color="auto" w:fill="E7F2EC"/>
+          </w:tcPr>
+          <w:p>
+            <w:r>
+              <w:rPr>
+                <w:b/>
+                <w:i w:val="0"/>
+                <w:color w:val="142A4F"/>
+                <w:sz w:val="20"/>
+              </w:rPr>
+              <w:t>W1 (13:30-15:45, two blocks with a 15-min break): Build your first RAG system, in Arabic</w:t>
             </w:r>
           </w:p>
           <w:p>
@@ -862,256 +1198,6 @@
                 <w:sz w:val="18"/>
               </w:rPr>
               <w:t>Laptop, Google account (Colab), basic Python. No local installs needed.</w:t>
-            </w:r>
-          </w:p>
-        </w:tc>
-      </w:tr>
-    </w:tbl>
-    <w:p>
-      <w:pPr>
-        <w:spacing w:after="40"/>
-      </w:pPr>
-    </w:p>
-    <w:tbl>
-      <w:tblPr>
-        <w:tblStyle w:val="TableGrid"/>
-        <w:tblW w:type="auto" w:w="0"/>
-        <w:tblLayout w:type="fixed"/>
-        <w:tblLook w:firstColumn="1" w:firstRow="1" w:lastColumn="0" w:lastRow="0" w:noHBand="0" w:noVBand="1" w:val="04A0"/>
-      </w:tblPr>
-      <w:tblGrid>
-        <w:gridCol w:w="10206"/>
-      </w:tblGrid>
-      <w:tr>
-        <w:tc>
-          <w:tcPr>
-            <w:tcW w:type="dxa" w:w="10368"/>
-            <w:shd w:val="clear" w:color="auto" w:fill="E7F2EC"/>
-          </w:tcPr>
-          <w:p>
-            <w:r>
-              <w:rPr>
-                <w:b/>
-                <w:i w:val="0"/>
-                <w:color w:val="142A4F"/>
-                <w:sz w:val="20"/>
-              </w:rPr>
-              <w:t>W2 (13:30-15:00): From notebook to production: MLOps that survives contact with reality</w:t>
-            </w:r>
-          </w:p>
-          <w:p>
-            <w:r>
-              <w:rPr>
-                <w:b/>
-                <w:i w:val="0"/>
-                <w:sz w:val="18"/>
-              </w:rPr>
-              <w:t xml:space="preserve">Lead: </w:t>
-            </w:r>
-            <w:r>
-              <w:rPr>
-                <w:b w:val="0"/>
-                <w:i w:val="0"/>
-                <w:sz w:val="18"/>
-              </w:rPr>
-              <w:t>CONFIRMED: Dr. Hazem Ali (Founder and CEO, Skytells; Microsoft AI MVP). Day 16 or 17, his choice - penciled Day 1</w:t>
-            </w:r>
-          </w:p>
-          <w:p>
-            <w:r>
-              <w:rPr>
-                <w:b/>
-                <w:i w:val="0"/>
-                <w:sz w:val="18"/>
-              </w:rPr>
-              <w:t xml:space="preserve">Format split: </w:t>
-            </w:r>
-            <w:r>
-              <w:rPr>
-                <w:b w:val="0"/>
-                <w:i w:val="0"/>
-                <w:sz w:val="18"/>
-              </w:rPr>
-              <w:t>As agreed with him: 30 to 40 minutes talk, then 50 to 60 minutes hands-on with participants.</w:t>
-            </w:r>
-          </w:p>
-          <w:p>
-            <w:r>
-              <w:rPr>
-                <w:b/>
-                <w:i w:val="0"/>
-                <w:sz w:val="18"/>
-              </w:rPr>
-              <w:t xml:space="preserve">Content, in order: </w:t>
-            </w:r>
-            <w:r>
-              <w:rPr>
-                <w:b w:val="0"/>
-                <w:i w:val="0"/>
-                <w:sz w:val="18"/>
-              </w:rPr>
-              <w:t>(1) Talk: why models die in production: drift, silent failures, retraining debt, monitoring blind spots, with real cases from two decades of enterprise AI. (2) Hands-on: take a trained model from a notebook to a served endpoint: package it, containerize it, deploy, then attach basic monitoring and an alert.</w:t>
-            </w:r>
-          </w:p>
-          <w:p>
-            <w:r>
-              <w:rPr>
-                <w:b/>
-                <w:i w:val="0"/>
-                <w:sz w:val="18"/>
-              </w:rPr>
-              <w:t xml:space="preserve">What attendees leave with: </w:t>
-            </w:r>
-            <w:r>
-              <w:rPr>
-                <w:b w:val="0"/>
-                <w:i w:val="0"/>
-                <w:sz w:val="18"/>
-              </w:rPr>
-              <w:t>A model of their own deployed behind an endpoint with a live monitoring dashboard.</w:t>
-            </w:r>
-          </w:p>
-          <w:p>
-            <w:r>
-              <w:rPr>
-                <w:b/>
-                <w:i w:val="0"/>
-                <w:sz w:val="18"/>
-              </w:rPr>
-              <w:t xml:space="preserve">Prerequisites: </w:t>
-            </w:r>
-            <w:r>
-              <w:rPr>
-                <w:b w:val="0"/>
-                <w:i w:val="0"/>
-                <w:sz w:val="18"/>
-              </w:rPr>
-              <w:t>Laptop, basic Python, Docker installed or Colab fallback provided.</w:t>
-            </w:r>
-          </w:p>
-        </w:tc>
-      </w:tr>
-    </w:tbl>
-    <w:p>
-      <w:pPr>
-        <w:spacing w:after="40"/>
-      </w:pPr>
-    </w:p>
-    <w:tbl>
-      <w:tblPr>
-        <w:tblStyle w:val="TableGrid"/>
-        <w:tblW w:type="auto" w:w="0"/>
-        <w:tblLayout w:type="fixed"/>
-        <w:tblLook w:firstColumn="1" w:firstRow="1" w:lastColumn="0" w:lastRow="0" w:noHBand="0" w:noVBand="1" w:val="04A0"/>
-      </w:tblPr>
-      <w:tblGrid>
-        <w:gridCol w:w="10206"/>
-      </w:tblGrid>
-      <w:tr>
-        <w:tc>
-          <w:tcPr>
-            <w:tcW w:type="dxa" w:w="10368"/>
-            <w:shd w:val="clear" w:color="auto" w:fill="E7F2EC"/>
-          </w:tcPr>
-          <w:p>
-            <w:r>
-              <w:rPr>
-                <w:b/>
-                <w:i w:val="0"/>
-                <w:color w:val="142A4F"/>
-                <w:sz w:val="20"/>
-              </w:rPr>
-              <w:t>15:15-16:45: Evaluation clinic (small groups)</w:t>
-            </w:r>
-          </w:p>
-          <w:p>
-            <w:r>
-              <w:rPr>
-                <w:b/>
-                <w:i w:val="0"/>
-                <w:sz w:val="18"/>
-              </w:rPr>
-              <w:t xml:space="preserve">Lead: </w:t>
-            </w:r>
-            <w:r>
-              <w:rPr>
-                <w:b w:val="0"/>
-                <w:i w:val="0"/>
-                <w:sz w:val="18"/>
-              </w:rPr>
-              <w:t>OPEN - target: senior practitioner comfortable reviewing strangers' work live (good second slot for a Wave-2 confirm)</w:t>
-            </w:r>
-          </w:p>
-          <w:p>
-            <w:r>
-              <w:rPr>
-                <w:b/>
-                <w:i w:val="0"/>
-                <w:sz w:val="18"/>
-              </w:rPr>
-              <w:t xml:space="preserve">Format split: </w:t>
-            </w:r>
-            <w:r>
-              <w:rPr>
-                <w:b w:val="0"/>
-                <w:i w:val="0"/>
-                <w:sz w:val="18"/>
-              </w:rPr>
-              <w:t>Fully hands-on. No slides at all. Four working tables of up to 8, one facilitator each.</w:t>
-            </w:r>
-          </w:p>
-          <w:p>
-            <w:r>
-              <w:rPr>
-                <w:b/>
-                <w:i w:val="0"/>
-                <w:sz w:val="18"/>
-              </w:rPr>
-              <w:t xml:space="preserve">Content, in order: </w:t>
-            </w:r>
-            <w:r>
-              <w:rPr>
-                <w:b w:val="0"/>
-                <w:i w:val="0"/>
-                <w:sz w:val="18"/>
-              </w:rPr>
-              <w:t>Attendees bring their own model, notebook, or project. Each table runs a 20-minute cycle per project: define the metric that actually matters, build a minimal eval harness, find where the model is lying, write the next experiment. Facilitators rotate.</w:t>
-            </w:r>
-          </w:p>
-          <w:p>
-            <w:r>
-              <w:rPr>
-                <w:b/>
-                <w:i w:val="0"/>
-                <w:sz w:val="18"/>
-              </w:rPr>
-              <w:t xml:space="preserve">What attendees leave with: </w:t>
-            </w:r>
-            <w:r>
-              <w:rPr>
-                <w:b w:val="0"/>
-                <w:i w:val="0"/>
-                <w:sz w:val="18"/>
-              </w:rPr>
-              <w:t>Their own project evaluated properly, with a written next-steps card.</w:t>
-            </w:r>
-          </w:p>
-          <w:p>
-            <w:r>
-              <w:rPr>
-                <w:b/>
-                <w:i w:val="0"/>
-                <w:sz w:val="18"/>
-              </w:rPr>
-              <w:t xml:space="preserve">Prerequisites: </w:t>
-            </w:r>
-            <w:r>
-              <w:rPr>
-                <w:b w:val="0"/>
-                <w:i w:val="0"/>
-                <w:sz w:val="18"/>
-              </w:rPr>
-              <w:t>Bring your own project (announced at registration). Walk-ins pair up as reviewers.</w:t>
             </w:r>
           </w:p>
         </w:tc>
@@ -1377,7 +1463,7 @@
                 <w:i w:val="0"/>
                 <w:sz w:val="17"/>
               </w:rPr>
-              <w:t>Hall D: Startups and applied AI - opening session</w:t>
+              <w:t>Hall D: Startups and applied AI - opening talk</w:t>
             </w:r>
           </w:p>
         </w:tc>
@@ -1390,10 +1476,10 @@
               <w:rPr>
                 <w:b/>
                 <w:i w:val="0"/>
-                <w:color w:val="B07412"/>
+                <w:color w:val="B32D2D"/>
                 <w:sz w:val="17"/>
               </w:rPr>
-              <w:t>INVITED: Muhammad Gawish (iSchool): building an EdTech from Egypt to MENA scale</w:t>
+              <w:t>OPEN - target: founder or applied-AI lead (Flat6Labs/Falak network, Rology)</w:t>
             </w:r>
           </w:p>
         </w:tc>
@@ -1408,7 +1494,7 @@
                 <w:i w:val="0"/>
                 <w:sz w:val="17"/>
               </w:rPr>
-              <w:t>The iSchool story told operationally: first product, first hires, unit economics of education, scaling to 131,000 learners, and what he would not do again. 40 min talk, 20 min questions.</w:t>
+              <w:t>Taking an AI product to its first 100 customers in Egypt: pricing, data realities, first hires. Main-stage core sessions run in parallel; this hall serves the startup-focused subset.</w:t>
             </w:r>
           </w:p>
         </w:tc>
@@ -1586,10 +1672,10 @@
               <w:rPr>
                 <w:b/>
                 <w:i w:val="0"/>
-                <w:color w:val="B07412"/>
+                <w:color w:val="B32D2D"/>
                 <w:sz w:val="17"/>
               </w:rPr>
-              <w:t>INVITED: Asmaa Ahmed E. Osman (Staff AI Vision Scientist, Fawry; Lecturer, FCAI-CU)</w:t>
+              <w:t>OPEN - target: fintech/industry ML practitioner (Valify, e-finance, banks network)</w:t>
             </w:r>
           </w:p>
         </w:tc>
@@ -1605,7 +1691,7 @@
                 <w:i w:val="0"/>
                 <w:sz w:val="17"/>
               </w:rPr>
-              <w:t>Vision systems in production at Egypt's largest fintech: document and identity verification at national scale, where models fail on real documents, and the bridge between lecture hall and production line. 40 min + questions.</w:t>
+              <w:t>Applied ML in Egyptian finance and industry beyond vision: fraud, credit, forecasting. The headline Finance and Industry talk (Fawry) is on the main stage at 11:45.</w:t>
             </w:r>
           </w:p>
         </w:tc>
@@ -2844,6 +2930,131 @@
         <w:spacing w:after="40"/>
       </w:pPr>
     </w:p>
+    <w:tbl>
+      <w:tblPr>
+        <w:tblStyle w:val="TableGrid"/>
+        <w:tblW w:type="auto" w:w="0"/>
+        <w:tblLayout w:type="fixed"/>
+        <w:tblLook w:firstColumn="1" w:firstRow="1" w:lastColumn="0" w:lastRow="0" w:noHBand="0" w:noVBand="1" w:val="04A0"/>
+      </w:tblPr>
+      <w:tblGrid>
+        <w:gridCol w:w="10206"/>
+      </w:tblGrid>
+      <w:tr>
+        <w:tc>
+          <w:tcPr>
+            <w:tcW w:type="dxa" w:w="10368"/>
+            <w:shd w:val="clear" w:color="auto" w:fill="E7F2EC"/>
+          </w:tcPr>
+          <w:p>
+            <w:r>
+              <w:rPr>
+                <w:b/>
+                <w:i w:val="0"/>
+                <w:color w:val="142A4F"/>
+                <w:sz w:val="20"/>
+              </w:rPr>
+              <w:t>15:15-16:45: Evaluation clinic (small groups)</w:t>
+            </w:r>
+          </w:p>
+          <w:p>
+            <w:r>
+              <w:rPr>
+                <w:b/>
+                <w:i w:val="0"/>
+                <w:sz w:val="18"/>
+              </w:rPr>
+              <w:t xml:space="preserve">Lead: </w:t>
+            </w:r>
+            <w:r>
+              <w:rPr>
+                <w:b w:val="0"/>
+                <w:i w:val="0"/>
+                <w:sz w:val="18"/>
+              </w:rPr>
+              <w:t>OPEN - target: senior practitioners comfortable reviewing strangers' work live, 4 facilitators</w:t>
+            </w:r>
+          </w:p>
+          <w:p>
+            <w:r>
+              <w:rPr>
+                <w:b/>
+                <w:i w:val="0"/>
+                <w:sz w:val="18"/>
+              </w:rPr>
+              <w:t xml:space="preserve">Format split: </w:t>
+            </w:r>
+            <w:r>
+              <w:rPr>
+                <w:b w:val="0"/>
+                <w:i w:val="0"/>
+                <w:sz w:val="18"/>
+              </w:rPr>
+              <w:t>Fully hands-on. No slides at all. Four working tables of up to 8, one facilitator each.</w:t>
+            </w:r>
+          </w:p>
+          <w:p>
+            <w:r>
+              <w:rPr>
+                <w:b/>
+                <w:i w:val="0"/>
+                <w:sz w:val="18"/>
+              </w:rPr>
+              <w:t xml:space="preserve">Content, in order: </w:t>
+            </w:r>
+            <w:r>
+              <w:rPr>
+                <w:b w:val="0"/>
+                <w:i w:val="0"/>
+                <w:sz w:val="18"/>
+              </w:rPr>
+              <w:t>Attendees bring their own model, notebook, or project. Each table runs a 20-minute cycle per project: define the metric that actually matters, build a minimal eval harness, find where the model is lying, write the next experiment. Facilitators rotate.</w:t>
+            </w:r>
+          </w:p>
+          <w:p>
+            <w:r>
+              <w:rPr>
+                <w:b/>
+                <w:i w:val="0"/>
+                <w:sz w:val="18"/>
+              </w:rPr>
+              <w:t xml:space="preserve">What attendees leave with: </w:t>
+            </w:r>
+            <w:r>
+              <w:rPr>
+                <w:b w:val="0"/>
+                <w:i w:val="0"/>
+                <w:sz w:val="18"/>
+              </w:rPr>
+              <w:t>Their own project evaluated properly, with a written next-steps card.</w:t>
+            </w:r>
+          </w:p>
+          <w:p>
+            <w:r>
+              <w:rPr>
+                <w:b/>
+                <w:i w:val="0"/>
+                <w:sz w:val="18"/>
+              </w:rPr>
+              <w:t xml:space="preserve">Prerequisites: </w:t>
+            </w:r>
+            <w:r>
+              <w:rPr>
+                <w:b w:val="0"/>
+                <w:i w:val="0"/>
+                <w:sz w:val="18"/>
+              </w:rPr>
+              <w:t>Bring your own project (announced at registration). Walk-ins pair up as reviewers.</w:t>
+            </w:r>
+          </w:p>
+        </w:tc>
+      </w:tr>
+    </w:tbl>
+    <w:p>
+      <w:pPr>
+        <w:spacing w:after="40"/>
+      </w:pPr>
+    </w:p>
     <w:p>
       <w:pPr>
         <w:spacing w:after="60" w:before="120"/>
@@ -3879,7 +4090,7 @@
                 <w:i w:val="0"/>
                 <w:sz w:val="17"/>
               </w:rPr>
-              <w:t>D1 15:15</w:t>
+              <w:t>D2 15:15</w:t>
             </w:r>
           </w:p>
         </w:tc>
@@ -3945,7 +4156,7 @@
                 <w:i w:val="0"/>
                 <w:sz w:val="17"/>
               </w:rPr>
-              <w:t>D2 10:20</w:t>
+              <w:t>D1 10:20</w:t>
             </w:r>
           </w:p>
         </w:tc>
@@ -3960,7 +4171,7 @@
                 <w:i w:val="0"/>
                 <w:sz w:val="17"/>
               </w:rPr>
-              <w:t>W3 lead: Agentic AI</w:t>
+              <w:t>Hall D startups opening talk</w:t>
             </w:r>
           </w:p>
         </w:tc>
@@ -3991,7 +4202,137 @@
                 <w:i w:val="0"/>
                 <w:sz w:val="17"/>
               </w:rPr>
+              <w:t>Founder or applied-AI lead; Flat6Labs/Falak/Rology network.</w:t>
+            </w:r>
+          </w:p>
+        </w:tc>
+      </w:tr>
+      <w:tr>
+        <w:tc>
+          <w:tcPr>
+            <w:tcW w:type="dxa" w:w="1080"/>
+            <w:shd w:val="clear" w:color="auto" w:fill="EEF4F2"/>
+          </w:tcPr>
+          <w:p>
+            <w:r>
+              <w:rPr>
+                <w:b/>
+                <w:i w:val="0"/>
+                <w:sz w:val="17"/>
+              </w:rPr>
+              <w:t>D2 10:20</w:t>
+            </w:r>
+          </w:p>
+        </w:tc>
+        <w:tc>
+          <w:tcPr>
+            <w:tcW w:type="dxa" w:w="2160"/>
+            <w:shd w:val="clear" w:color="auto" w:fill="EEF4F2"/>
+          </w:tcPr>
+          <w:p>
+            <w:r>
+              <w:rPr>
+                <w:b/>
+                <w:i w:val="0"/>
+                <w:sz w:val="17"/>
+              </w:rPr>
+              <w:t>W3 lead: Agentic AI</w:t>
+            </w:r>
+          </w:p>
+        </w:tc>
+        <w:tc>
+          <w:tcPr>
+            <w:tcW w:type="dxa" w:w="1944"/>
+            <w:shd w:val="clear" w:color="auto" w:fill="EEF4F2"/>
+          </w:tcPr>
+          <w:p>
+            <w:r>
+              <w:rPr>
+                <w:b/>
+                <w:i w:val="0"/>
+                <w:color w:val="B32D2D"/>
+                <w:sz w:val="17"/>
+              </w:rPr>
+              <w:t>OPEN</w:t>
+            </w:r>
+          </w:p>
+        </w:tc>
+        <w:tc>
+          <w:tcPr>
+            <w:tcW w:type="dxa" w:w="5184"/>
+            <w:shd w:val="clear" w:color="auto" w:fill="EEF4F2"/>
+          </w:tcPr>
+          <w:p>
+            <w:r>
+              <w:rPr>
+                <w:b w:val="0"/>
+                <w:i w:val="0"/>
+                <w:sz w:val="17"/>
+              </w:rPr>
               <w:t>Same profile as W1; can be same person if strong.</w:t>
+            </w:r>
+          </w:p>
+        </w:tc>
+      </w:tr>
+      <w:tr>
+        <w:tc>
+          <w:tcPr>
+            <w:tcW w:type="dxa" w:w="1080"/>
+          </w:tcPr>
+          <w:p>
+            <w:r>
+              <w:rPr>
+                <w:b/>
+                <w:i w:val="0"/>
+                <w:sz w:val="17"/>
+              </w:rPr>
+              <w:t>D1/D2</w:t>
+            </w:r>
+          </w:p>
+        </w:tc>
+        <w:tc>
+          <w:tcPr>
+            <w:tcW w:type="dxa" w:w="2160"/>
+          </w:tcPr>
+          <w:p>
+            <w:r>
+              <w:rPr>
+                <w:b/>
+                <w:i w:val="0"/>
+                <w:sz w:val="17"/>
+              </w:rPr>
+              <w:t>Hall B healthcare talks x3</w:t>
+            </w:r>
+          </w:p>
+        </w:tc>
+        <w:tc>
+          <w:tcPr>
+            <w:tcW w:type="dxa" w:w="1944"/>
+          </w:tcPr>
+          <w:p>
+            <w:r>
+              <w:rPr>
+                <w:b/>
+                <w:i w:val="0"/>
+                <w:color w:val="B32D2D"/>
+                <w:sz w:val="17"/>
+              </w:rPr>
+              <w:t>OPEN</w:t>
+            </w:r>
+          </w:p>
+        </w:tc>
+        <w:tc>
+          <w:tcPr>
+            <w:tcW w:type="dxa" w:w="5184"/>
+          </w:tcPr>
+          <w:p>
+            <w:r>
+              <w:rPr>
+                <w:b w:val="0"/>
+                <w:i w:val="0"/>
+                <w:sz w:val="17"/>
+              </w:rPr>
+              <w:t>Clinical-AI practitioners; Rology thread + Asmaa referrals (FCAI network).</w:t>
             </w:r>
           </w:p>
         </w:tc>
@@ -4025,7 +4366,7 @@
                 <w:i w:val="0"/>
                 <w:sz w:val="17"/>
               </w:rPr>
-              <w:t>Hall B healthcare talks x3</w:t>
+              <w:t>Hall C speech + responsible AI</w:t>
             </w:r>
           </w:p>
         </w:tc>
@@ -4058,7 +4399,7 @@
                 <w:i w:val="0"/>
                 <w:sz w:val="17"/>
               </w:rPr>
-              <w:t>Clinical-AI practitioners; Rology thread + Asmaa referrals (FCAI network).</w:t>
+              <w:t>Speech: RDI alumni. Responsible AI: Diab network or DLI network.</w:t>
             </w:r>
           </w:p>
         </w:tc>
@@ -4090,7 +4431,7 @@
                 <w:i w:val="0"/>
                 <w:sz w:val="17"/>
               </w:rPr>
-              <w:t>Hall C speech + responsible AI</w:t>
+              <w:t>Industry talks x4 + case studies x2</w:t>
             </w:r>
           </w:p>
         </w:tc>
@@ -4121,7 +4462,7 @@
                 <w:i w:val="0"/>
                 <w:sz w:val="17"/>
               </w:rPr>
-              <w:t>Speech: RDI alumni. Responsible AI: Diab network or DLI network.</w:t>
+              <w:t>Sold with Gold/Platinum. Technical case-study rule enforced.</w:t>
             </w:r>
           </w:p>
         </w:tc>
@@ -4139,7 +4480,7 @@
                 <w:i w:val="0"/>
                 <w:sz w:val="17"/>
               </w:rPr>
-              <w:t>D1/D2</w:t>
+              <w:t>D2 16:15</w:t>
             </w:r>
           </w:p>
         </w:tc>
@@ -4155,7 +4496,7 @@
                 <w:i w:val="0"/>
                 <w:sz w:val="17"/>
               </w:rPr>
-              <w:t>Industry talks x4 + case studies x2</w:t>
+              <w:t>Panel seats x3 beside Prof. Hamza</w:t>
             </w:r>
           </w:p>
         </w:tc>
@@ -4180,69 +4521,6 @@
           <w:tcPr>
             <w:tcW w:type="dxa" w:w="5184"/>
             <w:shd w:val="clear" w:color="auto" w:fill="EEF4F2"/>
-          </w:tcPr>
-          <w:p>
-            <w:r>
-              <w:rPr>
-                <w:b w:val="0"/>
-                <w:i w:val="0"/>
-                <w:sz w:val="17"/>
-              </w:rPr>
-              <w:t>Sold with Gold/Platinum. Technical case-study rule enforced.</w:t>
-            </w:r>
-          </w:p>
-        </w:tc>
-      </w:tr>
-      <w:tr>
-        <w:tc>
-          <w:tcPr>
-            <w:tcW w:type="dxa" w:w="1080"/>
-          </w:tcPr>
-          <w:p>
-            <w:r>
-              <w:rPr>
-                <w:b/>
-                <w:i w:val="0"/>
-                <w:sz w:val="17"/>
-              </w:rPr>
-              <w:t>D2 16:15</w:t>
-            </w:r>
-          </w:p>
-        </w:tc>
-        <w:tc>
-          <w:tcPr>
-            <w:tcW w:type="dxa" w:w="2160"/>
-          </w:tcPr>
-          <w:p>
-            <w:r>
-              <w:rPr>
-                <w:b/>
-                <w:i w:val="0"/>
-                <w:sz w:val="17"/>
-              </w:rPr>
-              <w:t>Panel seats x3 beside Prof. Hamza</w:t>
-            </w:r>
-          </w:p>
-        </w:tc>
-        <w:tc>
-          <w:tcPr>
-            <w:tcW w:type="dxa" w:w="1944"/>
-          </w:tcPr>
-          <w:p>
-            <w:r>
-              <w:rPr>
-                <w:b/>
-                <w:i w:val="0"/>
-                <w:color w:val="B32D2D"/>
-                <w:sz w:val="17"/>
-              </w:rPr>
-              <w:t>OPEN</w:t>
-            </w:r>
-          </w:p>
-        </w:tc>
-        <w:tc>
-          <w:tcPr>
-            <w:tcW w:type="dxa" w:w="5184"/>
           </w:tcPr>
           <w:p>
             <w:r>

</xml_diff>

<commit_message>
Master Plan v3: Abdel-Aty confirmed opening, Elshenawy penciled, Shama W1 lead, inbound call-for-speakers channel live
</commit_message>
<xml_diff>
--- a/docs/IndabaX_2026_Program_Master_Plan.docx
+++ b/docs/IndabaX_2026_Program_Master_Plan.docx
@@ -100,6 +100,24 @@
                 <w:sz w:val="18"/>
               </w:rPr>
               <w:t>the main stage belongs to the people the conference stands on (confirmed core speakers, marquee guests) plus the published Gold/Platinum 30-minute slots. Halls host labs, parallel open sessions and student talks. Workshop talk-parts happen on the main stage; only the hands-on part moves to Hall A.</w:t>
+            </w:r>
+          </w:p>
+          <w:p>
+            <w:r>
+              <w:rPr>
+                <w:b/>
+                <w:i w:val="0"/>
+                <w:sz w:val="18"/>
+              </w:rPr>
+              <w:t xml:space="preserve">Inbound channel OPEN (19 July): </w:t>
+            </w:r>
+            <w:r>
+              <w:rPr>
+                <w:b w:val="0"/>
+                <w:i w:val="0"/>
+                <w:sz w:val="18"/>
+              </w:rPr>
+              <w:t>the public Call for Speakers &amp; Workshop Leads is live (poster + QR + form). Open slots below are now filled from reviewed applications first; direct invitations only for named strategic targets.</w:t>
             </w:r>
           </w:p>
         </w:tc>
@@ -382,7 +400,7 @@
                 <w:i w:val="0"/>
                 <w:sz w:val="17"/>
               </w:rPr>
-              <w:t>Opening keynote: Raising trusted AI</w:t>
+              <w:t>Opening keynote</w:t>
             </w:r>
           </w:p>
         </w:tc>
@@ -395,10 +413,10 @@
               <w:rPr>
                 <w:b/>
                 <w:i w:val="0"/>
-                <w:color w:val="B07412"/>
+                <w:color w:val="0F6E5E"/>
                 <w:sz w:val="17"/>
               </w:rPr>
-              <w:t>INVITED: Mo Gawdat (in person or remote). Fallback: strongest confirmed keynote</w:t>
+              <w:t>CONFIRMED: Prof. Mahmoud Abdel-Aty</w:t>
             </w:r>
           </w:p>
         </w:tc>
@@ -413,7 +431,7 @@
                 <w:i w:val="0"/>
                 <w:sz w:val="17"/>
               </w:rPr>
-              <w:t>40 minutes. The trust question in GenAI: hallucination, alignment, and who teaches the machines. Framed for young builders: what to build and what to refuse to build. 10 minutes moderated questions included.</w:t>
+              <w:t>40 minutes. The conference opens with one of Egypt's most cited scientists: frontier science meets AI, and the standard this generation should hold itself to. (If Mo Gawdat accepts his pending invitation, he takes the 16:15 plenary of Day 1 or Day 2 per slot rules.)</w:t>
             </w:r>
           </w:p>
         </w:tc>
@@ -577,7 +595,7 @@
                 <w:i w:val="0"/>
                 <w:sz w:val="17"/>
               </w:rPr>
-              <w:t>Main-stage session: building iSchool from Egypt to MENA scale</w:t>
+              <w:t>Main-stage session: applied AI engineering</w:t>
             </w:r>
           </w:p>
         </w:tc>
@@ -591,10 +609,10 @@
               <w:rPr>
                 <w:b/>
                 <w:i w:val="0"/>
-                <w:color w:val="B07412"/>
+                <w:color w:val="0F6E5E"/>
                 <w:sz w:val="17"/>
               </w:rPr>
-              <w:t>INVITED: Muhammad Gawish (Co-founder and CEO, iSchool)</w:t>
+              <w:t>CONFIRMED: Ali Elshenawy (penciled here; topic and slot to be settled with him)</w:t>
             </w:r>
           </w:p>
         </w:tc>
@@ -610,7 +628,7 @@
                 <w:i w:val="0"/>
                 <w:sz w:val="17"/>
               </w:rPr>
-              <w:t>35 minutes plus 10 of questions. The story told operationally: first product, first hires, the economics of education, 131,000 learners, and what he would not do again.</w:t>
+              <w:t>35 minutes plus 10 of questions. Applied AI and engineering in practice; exact topic confirmed directly with the speaker.</w:t>
             </w:r>
           </w:p>
         </w:tc>
@@ -854,7 +872,7 @@
                 <w:color w:val="B32D2D"/>
                 <w:sz w:val="17"/>
               </w:rPr>
-              <w:t>RESERVED for late marquee acceptance (e.g., Dr. Awadallah) else becomes extended networking</w:t>
+              <w:t>RESERVED for late marquee acceptance, else becomes extended networking</w:t>
             </w:r>
           </w:p>
         </w:tc>
@@ -1107,7 +1125,7 @@
                 <w:color w:val="142A4F"/>
                 <w:sz w:val="20"/>
               </w:rPr>
-              <w:t>W1 (13:30-15:45, two blocks with a 15-min break): Build your first RAG system, in Arabic</w:t>
+              <w:t>W1 (13:30-15:45, two blocks with a 15-min break): hands-on workshop</w:t>
             </w:r>
           </w:p>
           <w:p>
@@ -1125,7 +1143,7 @@
                 <w:i w:val="0"/>
                 <w:sz w:val="18"/>
               </w:rPr>
-              <w:t>OPEN - target: GenAI practitioner who ships retrieval systems (candidates: Hazem Ali referral network, Microsoft MVPs, Omar Maher team)</w:t>
+              <w:t>CONFIRMED: Shama Wache (TU Chemnitz; AIMS South Africa background) - exact topic being finalized with him; RAG build below is the default spec if it fits his stack</w:t>
             </w:r>
           </w:p>
           <w:p>

</xml_diff>

<commit_message>
Master Plan: Ali Elshenawy workshop (Hall A), Usama Makhlouf & Amin Rabea GenAI talk Day 2
</commit_message>
<xml_diff>
--- a/docs/IndabaX_2026_Program_Master_Plan.docx
+++ b/docs/IndabaX_2026_Program_Master_Plan.docx
@@ -595,7 +595,7 @@
                 <w:i w:val="0"/>
                 <w:sz w:val="17"/>
               </w:rPr>
-              <w:t>Main-stage session: applied AI engineering</w:t>
+              <w:t>Main-stage session (open slot)</w:t>
             </w:r>
           </w:p>
         </w:tc>
@@ -609,10 +609,10 @@
               <w:rPr>
                 <w:b/>
                 <w:i w:val="0"/>
-                <w:color w:val="0F6E5E"/>
+                <w:color w:val="B32D2D"/>
                 <w:sz w:val="17"/>
               </w:rPr>
-              <w:t>CONFIRMED: Ali Elshenawy (penciled here; topic and slot to be settled with him)</w:t>
+              <w:t>OPEN</w:t>
             </w:r>
           </w:p>
         </w:tc>
@@ -628,7 +628,7 @@
                 <w:i w:val="0"/>
                 <w:sz w:val="17"/>
               </w:rPr>
-              <w:t>35 minutes plus 10 of questions. Applied AI and engineering in practice; exact topic confirmed directly with the speaker.</w:t>
+              <w:t>Available main-stage slot; fill from a confirmed speaker or a reviewed application.</w:t>
             </w:r>
           </w:p>
         </w:tc>
@@ -975,6 +975,131 @@
         </w:rPr>
         <w:t>Hall A - Workshops (hands-on room). Rule: talk parts happen on the main stage; Hall A is for building only</w:t>
       </w:r>
+    </w:p>
+    <w:tbl>
+      <w:tblPr>
+        <w:tblStyle w:val="TableGrid"/>
+        <w:tblW w:type="auto" w:w="0"/>
+        <w:tblLayout w:type="fixed"/>
+        <w:tblLook w:firstColumn="1" w:firstRow="1" w:lastColumn="0" w:lastRow="0" w:noHBand="0" w:noVBand="1" w:val="04A0"/>
+      </w:tblPr>
+      <w:tblGrid>
+        <w:gridCol w:w="10206"/>
+      </w:tblGrid>
+      <w:tr>
+        <w:tc>
+          <w:tcPr>
+            <w:tcW w:type="dxa" w:w="10368"/>
+            <w:shd w:val="clear" w:color="auto" w:fill="E7F2EC"/>
+          </w:tcPr>
+          <w:p>
+            <w:r>
+              <w:rPr>
+                <w:b/>
+                <w:i w:val="0"/>
+                <w:color w:val="142A4F"/>
+                <w:sz w:val="20"/>
+              </w:rPr>
+              <w:t>WA (Day 1): hands-on workshop, led by Ali Elshenawy</w:t>
+            </w:r>
+          </w:p>
+          <w:p>
+            <w:r>
+              <w:rPr>
+                <w:b/>
+                <w:i w:val="0"/>
+                <w:sz w:val="18"/>
+              </w:rPr>
+              <w:t xml:space="preserve">Lead: </w:t>
+            </w:r>
+            <w:r>
+              <w:rPr>
+                <w:b w:val="0"/>
+                <w:i w:val="0"/>
+                <w:sz w:val="18"/>
+              </w:rPr>
+              <w:t>CONFIRMED: Ali Elshenawy (MSc in AI, University of Ottawa, Canada) - exact topic being finalized with him</w:t>
+            </w:r>
+          </w:p>
+          <w:p>
+            <w:r>
+              <w:rPr>
+                <w:b/>
+                <w:i w:val="0"/>
+                <w:sz w:val="18"/>
+              </w:rPr>
+              <w:t xml:space="preserve">Format split: </w:t>
+            </w:r>
+            <w:r>
+              <w:rPr>
+                <w:b w:val="0"/>
+                <w:i w:val="0"/>
+                <w:sz w:val="18"/>
+              </w:rPr>
+              <w:t>Fully hands-on. Talk portion (if any) on the main stage; building happens here.</w:t>
+            </w:r>
+          </w:p>
+          <w:p>
+            <w:r>
+              <w:rPr>
+                <w:b/>
+                <w:i w:val="0"/>
+                <w:sz w:val="18"/>
+              </w:rPr>
+              <w:t xml:space="preserve">Content, in order: </w:t>
+            </w:r>
+            <w:r>
+              <w:rPr>
+                <w:b w:val="0"/>
+                <w:i w:val="0"/>
+                <w:sz w:val="18"/>
+              </w:rPr>
+              <w:t>To be confirmed with the workshop lead.</w:t>
+            </w:r>
+          </w:p>
+          <w:p>
+            <w:r>
+              <w:rPr>
+                <w:b/>
+                <w:i w:val="0"/>
+                <w:sz w:val="18"/>
+              </w:rPr>
+              <w:t xml:space="preserve">What attendees leave with: </w:t>
+            </w:r>
+            <w:r>
+              <w:rPr>
+                <w:b w:val="0"/>
+                <w:i w:val="0"/>
+                <w:sz w:val="18"/>
+              </w:rPr>
+              <w:t>A working artifact each attendee builds during the session.</w:t>
+            </w:r>
+          </w:p>
+          <w:p>
+            <w:r>
+              <w:rPr>
+                <w:b/>
+                <w:i w:val="0"/>
+                <w:sz w:val="18"/>
+              </w:rPr>
+              <w:t xml:space="preserve">Prerequisites: </w:t>
+            </w:r>
+            <w:r>
+              <w:rPr>
+                <w:b w:val="0"/>
+                <w:i w:val="0"/>
+                <w:sz w:val="18"/>
+              </w:rPr>
+              <w:t>Laptop; specifics announced once the topic is set.</w:t>
+            </w:r>
+          </w:p>
+        </w:tc>
+      </w:tr>
+    </w:tbl>
+    <w:p>
+      <w:pPr>
+        <w:spacing w:after="40"/>
+      </w:pPr>
     </w:p>
     <w:tbl>
       <w:tblPr>
@@ -3307,7 +3432,7 @@
                 <w:color w:val="B32D2D"/>
                 <w:sz w:val="17"/>
               </w:rPr>
-              <w:t>OPEN - target: speech practitioner (RDI alumni network, Hamza referral)</w:t>
+              <w:t>OPEN - target: speech practitioner</w:t>
             </w:r>
           </w:p>
         </w:tc>
@@ -3355,7 +3480,7 @@
                 <w:i w:val="0"/>
                 <w:sz w:val="17"/>
               </w:rPr>
-              <w:t>Hall D: founders clinic</w:t>
+              <w:t>Hall C: GenAI and LLMs - Neural Networks, Beyond the Black Box</w:t>
             </w:r>
           </w:p>
         </w:tc>
@@ -3368,10 +3493,10 @@
               <w:rPr>
                 <w:b/>
                 <w:i w:val="0"/>
-                <w:color w:val="B32D2D"/>
+                <w:color w:val="0F6E5E"/>
                 <w:sz w:val="17"/>
               </w:rPr>
-              <w:t>OPEN - target: 2 founders + 1 investor (Flat6Labs/Falak contacts)</w:t>
+              <w:t>CONFIRMED: Usama Makhlouf &amp; Amin Rabea</w:t>
             </w:r>
           </w:p>
         </w:tc>
@@ -3386,7 +3511,7 @@
                 <w:i w:val="0"/>
                 <w:sz w:val="17"/>
               </w:rPr>
-              <w:t>Office-hours format: startups in the room get 15 minutes each of blunt feedback on their AI product from founders who shipped.</w:t>
+              <w:t>What is really happening inside neural networks: activations, attention and the math behind them, made intuitive. For undergraduates and up who know the basics and want to see past the black box.</w:t>
             </w:r>
           </w:p>
         </w:tc>
@@ -3404,7 +3529,7 @@
                 <w:i w:val="0"/>
                 <w:sz w:val="17"/>
               </w:rPr>
-              <w:t>11:30-12:30</w:t>
+              <w:t>10:20-11:20</w:t>
             </w:r>
           </w:p>
         </w:tc>
@@ -3420,7 +3545,7 @@
                 <w:i w:val="0"/>
                 <w:sz w:val="17"/>
               </w:rPr>
-              <w:t>Hall B/C/D</w:t>
+              <w:t>Hall D: founders clinic</w:t>
             </w:r>
           </w:p>
         </w:tc>
@@ -3437,7 +3562,7 @@
                 <w:color w:val="B32D2D"/>
                 <w:sz w:val="17"/>
               </w:rPr>
-              <w:t>-</w:t>
+              <w:t>OPEN - target: 2 founders + 1 investor (Flat6Labs/Falak contacts)</w:t>
             </w:r>
           </w:p>
         </w:tc>
@@ -3445,6 +3570,69 @@
           <w:tcPr>
             <w:tcW w:type="dxa" w:w="5184"/>
             <w:shd w:val="clear" w:color="auto" w:fill="EEF4F2"/>
+          </w:tcPr>
+          <w:p>
+            <w:r>
+              <w:rPr>
+                <w:b w:val="0"/>
+                <w:i w:val="0"/>
+                <w:sz w:val="17"/>
+              </w:rPr>
+              <w:t>Office-hours format: startups in the room get 15 minutes each of blunt feedback on their AI product from founders who shipped.</w:t>
+            </w:r>
+          </w:p>
+        </w:tc>
+      </w:tr>
+      <w:tr>
+        <w:tc>
+          <w:tcPr>
+            <w:tcW w:type="dxa" w:w="1080"/>
+          </w:tcPr>
+          <w:p>
+            <w:r>
+              <w:rPr>
+                <w:b/>
+                <w:i w:val="0"/>
+                <w:sz w:val="17"/>
+              </w:rPr>
+              <w:t>11:30-12:30</w:t>
+            </w:r>
+          </w:p>
+        </w:tc>
+        <w:tc>
+          <w:tcPr>
+            <w:tcW w:type="dxa" w:w="2160"/>
+          </w:tcPr>
+          <w:p>
+            <w:r>
+              <w:rPr>
+                <w:b/>
+                <w:i w:val="0"/>
+                <w:sz w:val="17"/>
+              </w:rPr>
+              <w:t>Hall B/C/D</w:t>
+            </w:r>
+          </w:p>
+        </w:tc>
+        <w:tc>
+          <w:tcPr>
+            <w:tcW w:type="dxa" w:w="1944"/>
+          </w:tcPr>
+          <w:p>
+            <w:r>
+              <w:rPr>
+                <w:b/>
+                <w:i w:val="0"/>
+                <w:color w:val="B32D2D"/>
+                <w:sz w:val="17"/>
+              </w:rPr>
+              <w:t>-</w:t>
+            </w:r>
+          </w:p>
+        </w:tc>
+        <w:tc>
+          <w:tcPr>
+            <w:tcW w:type="dxa" w:w="5184"/>
           </w:tcPr>
           <w:p>
             <w:r>

</xml_diff>